<commit_message>
feat(T7): course 表建成 + GET /courses 接口（待调试）
- sql/init.sql：末尾追加 course 建表（不带 drop，本人自己敲）
- backend/main.py：新增 GET /courses（连库→execute→fetchall→返回 JSON）
  已知 3 处待修：字段拼写 capaity、漏 teacher_id、row/rows 变量名不一致
- docs：日记续写 2026-09-21；手册/进度 T7 状态与新增接口行同步
</commit_message>
<xml_diff>
--- a/docs/学习总结完整版.docx
+++ b/docs/学习总结完整版.docx
@@ -1360,6 +1360,16 @@
           <w:b w:val="0"/>
           <w:sz w:val="22"/>
         </w:rPr>
+        <w:t>GET /courses  |  课程列表（无 where，全部课程；公开接口，暂不验 token）——2026-09-21 新增，待调试</w:t>
+      </w:r>
+    </w:p>
+    <w:p>
+      <w:r>
+        <w:rPr>
+          <w:rFonts w:ascii="Microsoft YaHei" w:hAnsi="Microsoft YaHei" w:eastAsia="Microsoft YaHei"/>
+          <w:b w:val="0"/>
+          <w:sz w:val="22"/>
+        </w:rPr>
         <w:t>要点：查库用 %s 参数化；CORS 允许 http://localhost:5173；后端端口约定 8080（Apache 在 8030）。</w:t>
       </w:r>
     </w:p>
@@ -1440,7 +1450,7 @@
           <w:b w:val="0"/>
           <w:sz w:val="22"/>
         </w:rPr>
-        <w:t>课程列表 / 选课（原 T7/T8）← 当前最高优先级。T7 第 1 小步（course 表设计）已于 2026-09-20 完成，下一步写建表 SQL。</w:t>
+        <w:t>课程列表 / 选课（原 T7/T8）← 当前最高优先级。T7 进度：表已建成；GET /courses 待调试（3 处笔误）；再往后是前端列表页。</w:t>
       </w:r>
     </w:p>
     <w:p>
@@ -1830,7 +1840,7 @@
           <w:b w:val="0"/>
           <w:sz w:val="22"/>
         </w:rPr>
-        <w:t>T7  |  课程列表  |  已起步（9/20）：course 表设计定稿；下一步写 sql/init.sql 建表语句并在 Workbench 执行</w:t>
+        <w:t>T7  |  课程列表  |  进行中（9/21）：course 表已建成并写回 sql/init.sql；后端 GET /courses 已写、含 3 处笔误待调试；前端未做</w:t>
       </w:r>
     </w:p>
     <w:p>
@@ -2460,7 +2470,7 @@
           <w:b w:val="0"/>
           <w:sz w:val="22"/>
         </w:rPr>
-        <w:t>课程列表（T7）← 当前最高优先级；已起步：course 表设计定稿（2026-09-20），下一步写建表 SQL 并执行</w:t>
+        <w:t>课程列表（T7）← 当前最高优先级；进行中：course 表已建成（9/21），GET /courses 已写待调试，前端未做</w:t>
       </w:r>
     </w:p>
     <w:p>
@@ -3458,7 +3468,7 @@
           <w:b w:val="0"/>
           <w:sz w:val="22"/>
         </w:rPr>
-        <w:t>*最后更新：2026-09-20，T7 起步（course 表设计定稿）；T6 第一次 commit 已于 9/19 落地。*</w:t>
+        <w:t>*最后更新：2026-09-21，course 表建成 + 后端 GET /courses 已写（待调试）。*</w:t>
       </w:r>
     </w:p>
     <w:p>
@@ -7330,7 +7340,277 @@
           <w:b w:val="0"/>
           <w:sz w:val="22"/>
         </w:rPr>
-        <w:t>最后更新：2026-09-20，T7 第 1 小步（course 表设计定稿），代码未改动。</w:t>
+        <w:t>————————————————</w:t>
+      </w:r>
+    </w:p>
+    <w:p>
+      <w:r>
+        <w:rPr>
+          <w:rFonts w:ascii="Microsoft YaHei" w:hAnsi="Microsoft YaHei" w:eastAsia="Microsoft YaHei"/>
+          <w:b w:val="0"/>
+          <w:sz w:val="22"/>
+        </w:rPr>
+        <w:t>续写：2026-09-21（T7 第 2 小步 · course 表建成，后端接口已写待调试）</w:t>
+      </w:r>
+    </w:p>
+    <w:p>
+      <w:r>
+        <w:rPr>
+          <w:rFonts w:ascii="Microsoft YaHei" w:hAnsi="Microsoft YaHei" w:eastAsia="Microsoft YaHei"/>
+          <w:b w:val="0"/>
+          <w:sz w:val="22"/>
+        </w:rPr>
+        <w:t>今天做了什么</w:t>
+      </w:r>
+    </w:p>
+    <w:p>
+      <w:r>
+        <w:rPr>
+          <w:rFonts w:ascii="Microsoft YaHei" w:hAnsi="Microsoft YaHei" w:eastAsia="Microsoft YaHei"/>
+          <w:b w:val="0"/>
+          <w:sz w:val="22"/>
+        </w:rPr>
+        <w:t>在 Workbench 里自己敲 CREATE TABLE 建 course 表，成功（Query OK）。踩了两个错：先用单引号包表名导致 1064，后因没选库导致 1046；加 use course_selection; 后通过。</w:t>
+      </w:r>
+    </w:p>
+    <w:p>
+      <w:r>
+        <w:rPr>
+          <w:rFonts w:ascii="Microsoft YaHei" w:hAnsi="Microsoft YaHei" w:eastAsia="Microsoft YaHei"/>
+          <w:b w:val="0"/>
+          <w:sz w:val="22"/>
+        </w:rPr>
+        <w:t>把建表语句写回项目 sql/init.sql 末尾（自己敲的，位置在 2026-09-21 注释下面）。</w:t>
+      </w:r>
+    </w:p>
+    <w:p>
+      <w:r>
+        <w:rPr>
+          <w:rFonts w:ascii="Microsoft YaHei" w:hAnsi="Microsoft YaHei" w:eastAsia="Microsoft YaHei"/>
+          <w:b w:val="0"/>
+          <w:sz w:val="22"/>
+        </w:rPr>
+        <w:t>在 py 后端 main.py 里自己敲了 GET /courses 接口（位置在 /student-home 之后），连库 → execute → fetchall → 返回 {'msg':'ok','courses': rows}。注意此版本有 3 处笔误，尚未调试。</w:t>
+      </w:r>
+    </w:p>
+    <w:p>
+      <w:r>
+        <w:rPr>
+          <w:rFonts w:ascii="Microsoft YaHei" w:hAnsi="Microsoft YaHei" w:eastAsia="Microsoft YaHei"/>
+          <w:b w:val="0"/>
+          <w:sz w:val="22"/>
+        </w:rPr>
+        <w:t>补数据库四大操作（CRUD）：select 查 / insert 增 / update 改 / delete 删；update 与 delete 必须带 where，否则作用全表；DDL（create/alter/drop）管结构，DML 管数据。</w:t>
+      </w:r>
+    </w:p>
+    <w:p>
+      <w:r>
+        <w:rPr>
+          <w:rFonts w:ascii="Microsoft YaHei" w:hAnsi="Microsoft YaHei" w:eastAsia="Microsoft YaHei"/>
+          <w:b w:val="0"/>
+          <w:sz w:val="22"/>
+        </w:rPr>
+        <w:t>补 desc 的双重含义：desc 表名 = describe 查表结构（不返回数据行）；order by 字段 desc = 降序排序。两个 desc 是同一个词指两件事。</w:t>
+      </w:r>
+    </w:p>
+    <w:p>
+      <w:r>
+        <w:rPr>
+          <w:rFonts w:ascii="Microsoft YaHei" w:hAnsi="Microsoft YaHei" w:eastAsia="Microsoft YaHei"/>
+          <w:b w:val="0"/>
+          <w:sz w:val="22"/>
+        </w:rPr>
+        <w:t>搞懂接口鉴权的判断标准（本人原答 每一步都要 token，被纠正）：不是都验，而是看身份是否影响结果、数据是否敏感。登录/login 不可能要票；/courses 课程列表公开、不用票；/me、选课、录成绩必须验。成本只是顺带好处，不是主要理由。</w:t>
+      </w:r>
+    </w:p>
+    <w:p>
+      <w:r>
+        <w:rPr>
+          <w:rFonts w:ascii="Microsoft YaHei" w:hAnsi="Microsoft YaHei" w:eastAsia="Microsoft YaHei"/>
+          <w:b w:val="0"/>
+          <w:sz w:val="22"/>
+        </w:rPr>
+        <w:t>今日学到 / 今天想明白</w:t>
+      </w:r>
+    </w:p>
+    <w:p>
+      <w:r>
+        <w:rPr>
+          <w:rFonts w:ascii="Microsoft YaHei" w:hAnsi="Microsoft YaHei" w:eastAsia="Microsoft YaHei"/>
+          <w:b w:val="0"/>
+          <w:sz w:val="22"/>
+        </w:rPr>
+        <w:t>想明白：where 不是必备的。要筛某个人（登录）必须写；要全部（课程列表）就不写 where。要不要筛选取决于目的，不是漏不漏写的问题。</w:t>
+      </w:r>
+    </w:p>
+    <w:p>
+      <w:r>
+        <w:rPr>
+          <w:rFonts w:ascii="Microsoft YaHei" w:hAnsi="Microsoft YaHei" w:eastAsia="Microsoft YaHei"/>
+          <w:b w:val="0"/>
+          <w:sz w:val="22"/>
+        </w:rPr>
+        <w:t>想明白：fetchone 取一行（用户名唯一），fetchall 取多行（课程很多门）——选哪个由结果条数决定。</w:t>
+      </w:r>
+    </w:p>
+    <w:p>
+      <w:r>
+        <w:rPr>
+          <w:rFonts w:ascii="Microsoft YaHei" w:hAnsi="Microsoft YaHei" w:eastAsia="Microsoft YaHei"/>
+          <w:b w:val="0"/>
+          <w:sz w:val="22"/>
+        </w:rPr>
+        <w:t>想明白：返回结构只是把登录的 {'msg','data'(一个字典)} 换成 {'msg','courses'(一串字典)}；形状一样，内容从 一个 变成 一串。</w:t>
+      </w:r>
+    </w:p>
+    <w:p>
+      <w:r>
+        <w:rPr>
+          <w:rFonts w:ascii="Microsoft YaHei" w:hAnsi="Microsoft YaHei" w:eastAsia="Microsoft YaHei"/>
+          <w:b w:val="0"/>
+          <w:sz w:val="22"/>
+        </w:rPr>
+        <w:t>想明白：DictCursor 不能忘——不加的话 fetchall 返回的是元组，前端只能按下标取值，没法用字段名。</w:t>
+      </w:r>
+    </w:p>
+    <w:p>
+      <w:r>
+        <w:rPr>
+          <w:rFonts w:ascii="Microsoft YaHei" w:hAnsi="Microsoft YaHei" w:eastAsia="Microsoft YaHei"/>
+          <w:b w:val="0"/>
+          <w:sz w:val="22"/>
+        </w:rPr>
+        <w:t>想明白：SQL 报错会精确指到出错位置（near '原文'），且一次只报第一个错；改完第一个常会冒出下一个，属正常。</w:t>
+      </w:r>
+    </w:p>
+    <w:p>
+      <w:r>
+        <w:rPr>
+          <w:rFonts w:ascii="Microsoft YaHei" w:hAnsi="Microsoft YaHei" w:eastAsia="Microsoft YaHei"/>
+          <w:b w:val="0"/>
+          <w:sz w:val="22"/>
+        </w:rPr>
+        <w:t>想明白：执行过的 SQL 已在数据库生效，与保存成文件是两回事；Workbench 窗口是临时草稿，长期脚本要写回项目 init.sql。</w:t>
+      </w:r>
+    </w:p>
+    <w:p>
+      <w:r>
+        <w:rPr>
+          <w:rFonts w:ascii="Microsoft YaHei" w:hAnsi="Microsoft YaHei" w:eastAsia="Microsoft YaHei"/>
+          <w:b w:val="0"/>
+          <w:sz w:val="22"/>
+        </w:rPr>
+        <w:t>仍待消化（下次抽问）：主键/外键与唯一索引的区别；JOIN 的写法（还没写过）；CRUD 四条的 where 规则能否口述。</w:t>
+      </w:r>
+    </w:p>
+    <w:p>
+      <w:r>
+        <w:rPr>
+          <w:rFonts w:ascii="Microsoft YaHei" w:hAnsi="Microsoft YaHei" w:eastAsia="Microsoft YaHei"/>
+          <w:b w:val="0"/>
+          <w:sz w:val="22"/>
+        </w:rPr>
+        <w:t>进度变化</w:t>
+      </w:r>
+    </w:p>
+    <w:p>
+      <w:r>
+        <w:rPr>
+          <w:rFonts w:ascii="Microsoft YaHei" w:hAnsi="Microsoft YaHei" w:eastAsia="Microsoft YaHei"/>
+          <w:b w:val="0"/>
+          <w:sz w:val="22"/>
+        </w:rPr>
+        <w:t>T7 第 1 小步完成：course 表已在 MariaDB 建成（3 条测试数据：数据结构/计算机网络/操作系统，teacher_id 均为 2，credit 3.0/2.5/4.0，capacity 60/50/40）。</w:t>
+      </w:r>
+    </w:p>
+    <w:p>
+      <w:r>
+        <w:rPr>
+          <w:rFonts w:ascii="Microsoft YaHei" w:hAnsi="Microsoft YaHei" w:eastAsia="Microsoft YaHei"/>
+          <w:b w:val="0"/>
+          <w:sz w:val="22"/>
+        </w:rPr>
+        <w:t>建表语句已写回 sql/init.sql（末尾追加，不带 drop）。</w:t>
+      </w:r>
+    </w:p>
+    <w:p>
+      <w:r>
+        <w:rPr>
+          <w:rFonts w:ascii="Microsoft YaHei" w:hAnsi="Microsoft YaHei" w:eastAsia="Microsoft YaHei"/>
+          <w:b w:val="0"/>
+          <w:sz w:val="22"/>
+        </w:rPr>
+        <w:t>T7 第 2 小步进行中：GET /courses 已写入 main.py，含 3 处错误（字段拼写、漏字段、row/rows 变量名不一致），未调试、未联调。</w:t>
+      </w:r>
+    </w:p>
+    <w:p>
+      <w:r>
+        <w:rPr>
+          <w:rFonts w:ascii="Microsoft YaHei" w:hAnsi="Microsoft YaHei" w:eastAsia="Microsoft YaHei"/>
+          <w:b w:val="0"/>
+          <w:sz w:val="22"/>
+        </w:rPr>
+        <w:t>下次从哪接着（精确起点）</w:t>
+      </w:r>
+    </w:p>
+    <w:p>
+      <w:r>
+        <w:rPr>
+          <w:rFonts w:ascii="Microsoft YaHei" w:hAnsi="Microsoft YaHei" w:eastAsia="Microsoft YaHei"/>
+          <w:b w:val="0"/>
+          <w:sz w:val="22"/>
+        </w:rPr>
+        <w:t>启动后端：cd /d I:\EE （2）\backend → python -m uvicorn main:app --reload --port 8080。</w:t>
+      </w:r>
+    </w:p>
+    <w:p>
+      <w:r>
+        <w:rPr>
+          <w:rFonts w:ascii="Microsoft YaHei" w:hAnsi="Microsoft YaHei" w:eastAsia="Microsoft YaHei"/>
+          <w:b w:val="0"/>
+          <w:sz w:val="22"/>
+        </w:rPr>
+        <w:t>打开 http://localhost:8080/docs → GET /courses → Execute；同时看 uvicorn 终端里的红色报错，据此修 3 处笔误。</w:t>
+      </w:r>
+    </w:p>
+    <w:p>
+      <w:r>
+        <w:rPr>
+          <w:rFonts w:ascii="Microsoft YaHei" w:hAnsi="Microsoft YaHei" w:eastAsia="Microsoft YaHei"/>
+          <w:b w:val="0"/>
+          <w:sz w:val="22"/>
+        </w:rPr>
+        <w:t>修完确认返回 3 条课程 JSON；再进 T7 第 3 步：前端课程列表页（新路由 + v-for 循环显示）。</w:t>
+      </w:r>
+    </w:p>
+    <w:p>
+      <w:r>
+        <w:rPr>
+          <w:rFonts w:ascii="Microsoft YaHei" w:hAnsi="Microsoft YaHei" w:eastAsia="Microsoft YaHei"/>
+          <w:b w:val="0"/>
+          <w:sz w:val="22"/>
+        </w:rPr>
+        <w:t>口令：uvicorn 8080 → /docs → GET /courses → 看终端报错 → 修 3 处 → 通</w:t>
+      </w:r>
+    </w:p>
+    <w:p>
+      <w:r>
+        <w:rPr>
+          <w:rFonts w:ascii="Microsoft YaHei" w:hAnsi="Microsoft YaHei" w:eastAsia="Microsoft YaHei"/>
+          <w:b w:val="0"/>
+          <w:sz w:val="22"/>
+        </w:rPr>
+        <w:t>----------------------------------------------------------------</w:t>
+      </w:r>
+    </w:p>
+    <w:p>
+      <w:r>
+        <w:rPr>
+          <w:rFonts w:ascii="Microsoft YaHei" w:hAnsi="Microsoft YaHei" w:eastAsia="Microsoft YaHei"/>
+          <w:b w:val="0"/>
+          <w:sz w:val="22"/>
+        </w:rPr>
+        <w:t>最后更新：2026-09-21，course 表建成并写回 init.sql；GET /courses 已写待调试。</w:t>
       </w:r>
     </w:p>
     <w:p>

</xml_diff>

<commit_message>
feat(T7): 后端 /courses 收工 + seed.sql 规范化
- backend/main.py：/courses 补 teacher_id、键名改 courses（已测通返回 5 条）
- 新增 sql/seed.sql：truncate + 5 条课程最终值（幂等，可反复跑）
- docs：日记续写 2026-09-23（含 commit/持久化/备份/seed 概念纠正）；手册 T7 状态、
  接口行、第5节结构树（补回丢失的结构树）、第12节②同步更新
</commit_message>
<xml_diff>
--- a/docs/学习总结完整版.docx
+++ b/docs/学习总结完整版.docx
@@ -1130,27 +1130,17 @@
           <w:b w:val="0"/>
           <w:sz w:val="22"/>
         </w:rPr>
-        <w:t>本交接手册 / 进度说明 / 日记汇总 / 学习总结完整版 / 时间表约定（全部为 .docx，已无 md）+ _docx_tool.py（读写工具）</w:t>
-      </w:r>
-    </w:p>
-    <w:p>
-      <w:r>
-        <w:rPr>
-          <w:rFonts w:ascii="Microsoft YaHei" w:hAnsi="Microsoft YaHei" w:eastAsia="Microsoft YaHei"/>
-          <w:b w:val="0"/>
-          <w:sz w:val="22"/>
-        </w:rPr>
-        <w:t>无 .git。</w:t>
-      </w:r>
-    </w:p>
-    <w:p>
-      <w:r>
-        <w:rPr>
-          <w:rFonts w:ascii="Microsoft YaHei" w:hAnsi="Microsoft YaHei" w:eastAsia="Microsoft YaHei"/>
-          <w:b w:val="0"/>
-          <w:sz w:val="22"/>
-        </w:rPr>
-        <w:t>已作废（2026-09-19）：仓库已建。根目录 I:\EE （2）\.git 存在，已 init（9/13）、已完成第一次 commit（9/19，36a8086）。根 .gitignore 生效，node_modules 未入库。</w:t>
+        <w:t>I:\EE （2）\  sql\init.sql（建表：user / course）  sql\seed.sql（测试数据，可反复跑）  backend\main.py（全部接口）  backend\config.py（DB+JWT 配置）  backend\requirements.txt  frontend\src\（main.js / App.vue / router\index.js / views\Login.vue / views\Home.vue / api\ / store\）  docs\（交接手册 / 进度说明 / 日记汇总 / 学习总结完整版 / 时间表约定，全为 .docx）+ _docx_tool.py（读写工具）</w:t>
+      </w:r>
+    </w:p>
+    <w:p>
+      <w:r>
+        <w:rPr>
+          <w:rFonts w:ascii="Microsoft YaHei" w:hAnsi="Microsoft YaHei" w:eastAsia="Microsoft YaHei"/>
+          <w:b w:val="0"/>
+          <w:sz w:val="22"/>
+        </w:rPr>
+        <w:t>Git：仓库根 I:\EE （2）\.git 已 init（9/13）、已有第一次 commit（9/19，36a8086）；根 .gitignore 生效，node_modules 未入库。</w:t>
       </w:r>
     </w:p>
     <w:p>
@@ -1360,7 +1350,7 @@
           <w:b w:val="0"/>
           <w:sz w:val="22"/>
         </w:rPr>
-        <w:t>GET /courses  |  课程列表（无 where，全部课程；公开接口，暂不验 token）——2026-09-21 新增，待调试</w:t>
+        <w:t>GET /courses  |  课程列表（无 where，全部课程；公开接口不验 token）；返回 msg + courses，字段 id/course_name/teacher_id/credit/capacity——2026-09-23 已通</w:t>
       </w:r>
     </w:p>
     <w:p>
@@ -1450,7 +1440,7 @@
           <w:b w:val="0"/>
           <w:sz w:val="22"/>
         </w:rPr>
-        <w:t>课程列表 / 选课（原 T7/T8）← 当前最高优先级。T7 进度：表已建成；GET /courses 待调试（3 处笔误）；再往后是前端列表页。</w:t>
+        <w:t>课程列表 / 选课（原 T7/T8）← 当前最高优先级。进度：课程表+数据+后端接口已通；下一步前端列表页（v-for 渲染），再往后才是选课 T8。</w:t>
       </w:r>
     </w:p>
     <w:p>
@@ -1840,7 +1830,7 @@
           <w:b w:val="0"/>
           <w:sz w:val="22"/>
         </w:rPr>
-        <w:t>T7  |  课程列表  |  进行中（9/21）：course 表已建成并写回 sql/init.sql；后端 GET /courses 已写、含 3 处笔误待调试；前端未做</w:t>
+        <w:t>T7  |  课程列表  |  后端已完成（9/23）：GET /courses 通、返回 courses 列表；seed.sql 已规范化。前端未开始，下一步写 v-for 与 Courses.vue</w:t>
       </w:r>
     </w:p>
     <w:p>
@@ -2020,7 +2010,7 @@
           <w:b w:val="0"/>
           <w:sz w:val="22"/>
         </w:rPr>
-        <w:t>② 用户数据不在 init.sql 里：sql\init.sql 只建库建表（user 表结构），stu1 是当年用 Workbench 手工 INSERT 进去的。换机器只跑 init.sql 会没有测试用户，得自己补 INSERT。</w:t>
+        <w:t>② 数据分两个文件：sql\init.sql 只建库建表（表结构：user / course）；测试数据在 sql\seed.sql（开头 truncate + 5 条课程，幂等可反复跑）。注意 stu1 当年是手工 INSERT 进去的，不在 seed 里，换机器要自己补。</w:t>
       </w:r>
     </w:p>
     <w:p>
@@ -2470,7 +2460,7 @@
           <w:b w:val="0"/>
           <w:sz w:val="22"/>
         </w:rPr>
-        <w:t>课程列表（T7）← 当前最高优先级；进行中：course 表已建成（9/21），GET /courses 已写待调试，前端未做</w:t>
+        <w:t>课程列表（T7）← 后端已完成（9/23）：course 表 + seed 数据 + GET /courses 接口全通；前端列表页未做</w:t>
       </w:r>
     </w:p>
     <w:p>
@@ -3468,7 +3458,7 @@
           <w:b w:val="0"/>
           <w:sz w:val="22"/>
         </w:rPr>
-        <w:t>*最后更新：2026-09-21，course 表建成 + 后端 GET /courses 已写（待调试）。*</w:t>
+        <w:t>*最后更新：2026-09-23，T7 后端收工（/courses 通 + seed.sql 规范化），前端待做。*</w:t>
       </w:r>
     </w:p>
     <w:p>
@@ -7610,7 +7600,307 @@
           <w:b w:val="0"/>
           <w:sz w:val="22"/>
         </w:rPr>
-        <w:t>最后更新：2026-09-21，course 表建成并写回 init.sql；GET /courses 已写待调试。</w:t>
+        <w:t>————————————————</w:t>
+      </w:r>
+    </w:p>
+    <w:p>
+      <w:r>
+        <w:rPr>
+          <w:rFonts w:ascii="Microsoft YaHei" w:hAnsi="Microsoft YaHei" w:eastAsia="Microsoft YaHei"/>
+          <w:b w:val="0"/>
+          <w:sz w:val="22"/>
+        </w:rPr>
+        <w:t>续写：2026-09-23（T7 后端收工 · 查出空列表真因 · seed 文件规范化）</w:t>
+      </w:r>
+    </w:p>
+    <w:p>
+      <w:r>
+        <w:rPr>
+          <w:rFonts w:ascii="Microsoft YaHei" w:hAnsi="Microsoft YaHei" w:eastAsia="Microsoft YaHei"/>
+          <w:b w:val="0"/>
+          <w:sz w:val="22"/>
+        </w:rPr>
+        <w:t>今天做了什么</w:t>
+      </w:r>
+    </w:p>
+    <w:p>
+      <w:r>
+        <w:rPr>
+          <w:rFonts w:ascii="Microsoft YaHei" w:hAnsi="Microsoft YaHei" w:eastAsia="Microsoft YaHei"/>
+          <w:b w:val="0"/>
+          <w:sz w:val="22"/>
+        </w:rPr>
+        <w:t>启动后端（自己敲 uvicorn 命令，踩了 -m 位置错误：写成 python uvicorn -m ... 报 can't open file；正确是 python -m uvicorn main:app --reload --port 8080）。</w:t>
+      </w:r>
+    </w:p>
+    <w:p>
+      <w:r>
+        <w:rPr>
+          <w:rFonts w:ascii="Microsoft YaHei" w:hAnsi="Microsoft YaHei" w:eastAsia="Microsoft YaHei"/>
+          <w:b w:val="0"/>
+          <w:sz w:val="22"/>
+        </w:rPr>
+        <w:t>在 /docs 里测 GET /courses，起初看不到结果——原来只看到接口说明书，要先点 Try it out 再点 Execute。</w:t>
+      </w:r>
+    </w:p>
+    <w:p>
+      <w:r>
+        <w:rPr>
+          <w:rFonts w:ascii="Microsoft YaHei" w:hAnsi="Microsoft YaHei" w:eastAsia="Microsoft YaHei"/>
+          <w:b w:val="0"/>
+          <w:sz w:val="22"/>
+        </w:rPr>
+        <w:t>关键排查：接口返回 {'msg':'ok','course':[]} 空列表。查明 course 表存在但 0 行——之前那条 INSERT 从未真正进到 3306 的 course_selection 库。这属于「代码没错但结果不对」一类问题，排查顺序：先查库里有几条数据 → 再确认后端连的哪个库/端口 → 再看 SQL 条件 → 最后才怀疑代码。</w:t>
+      </w:r>
+    </w:p>
+    <w:p>
+      <w:r>
+        <w:rPr>
+          <w:rFonts w:ascii="Microsoft YaHei" w:hAnsi="Microsoft YaHei" w:eastAsia="Microsoft YaHei"/>
+          <w:b w:val="0"/>
+          <w:sz w:val="22"/>
+        </w:rPr>
+        <w:t>顺手确认：3306 上只有 course_selection 一个业务库；PyMySQL 默认不自动提交，漏 conn.commit() 是插入不生效的常见原因。</w:t>
+      </w:r>
+    </w:p>
+    <w:p>
+      <w:r>
+        <w:rPr>
+          <w:rFonts w:ascii="Microsoft YaHei" w:hAnsi="Microsoft YaHei" w:eastAsia="Microsoft YaHei"/>
+          <w:b w:val="0"/>
+          <w:sz w:val="22"/>
+        </w:rPr>
+        <w:t>补齐测试数据后接口返回正常。随后把 seed.sql 写规范：加 truncate 幂等、只写最终值、加注释说明用途。</w:t>
+      </w:r>
+    </w:p>
+    <w:p>
+      <w:r>
+        <w:rPr>
+          <w:rFonts w:ascii="Microsoft YaHei" w:hAnsi="Microsoft YaHei" w:eastAsia="Microsoft YaHei"/>
+          <w:b w:val="0"/>
+          <w:sz w:val="22"/>
+        </w:rPr>
+        <w:t>补 CRUD 的「改」：update 表 set 字段=新值 where 条件；多字段用逗号分隔（set a=1, b=2）；where 漏写会改全表。</w:t>
+      </w:r>
+    </w:p>
+    <w:p>
+      <w:r>
+        <w:rPr>
+          <w:rFonts w:ascii="Microsoft YaHei" w:hAnsi="Microsoft YaHei" w:eastAsia="Microsoft YaHei"/>
+          <w:b w:val="0"/>
+          <w:sz w:val="22"/>
+        </w:rPr>
+        <w:t>搞懂 update 打补丁 vs 改源文件的区别：能重建的测试数据应改 seed.sql 重跑（只写最终值，不写中间的 update）；只有不能推倒重建的真实数据才用 update/migration。</w:t>
+      </w:r>
+    </w:p>
+    <w:p>
+      <w:r>
+        <w:rPr>
+          <w:rFonts w:ascii="Microsoft YaHei" w:hAnsi="Microsoft YaHei" w:eastAsia="Microsoft YaHei"/>
+          <w:b w:val="0"/>
+          <w:sz w:val="22"/>
+        </w:rPr>
+        <w:t>搞懂 commit 与 .sql 文件是两件不相干的事：commit 是把数据写进数据库（持久化，关库重启都在），写 .sql 文件是给「重建环境」留说明书，必须手动做。</w:t>
+      </w:r>
+    </w:p>
+    <w:p>
+      <w:r>
+        <w:rPr>
+          <w:rFonts w:ascii="Microsoft YaHei" w:hAnsi="Microsoft YaHei" w:eastAsia="Microsoft YaHei"/>
+          <w:b w:val="0"/>
+          <w:sz w:val="22"/>
+        </w:rPr>
+        <w:t>搞懂备份与 seed 的区别（本人一度以为 seed 类似备份，已纠正）：备份是当前全部真实数据的快照（mysqldump），能完整还原；seed 只是出厂初始数据，用户后来产生的数据不在里面。</w:t>
+      </w:r>
+    </w:p>
+    <w:p>
+      <w:r>
+        <w:rPr>
+          <w:rFonts w:ascii="Microsoft YaHei" w:hAnsi="Microsoft YaHei" w:eastAsia="Microsoft YaHei"/>
+          <w:b w:val="0"/>
+          <w:sz w:val="22"/>
+        </w:rPr>
+        <w:t>搞懂外键没加约束时的风险：teacher_id 填 1 指向的是 stu1（学生）而不是老师，数据库不会拦；正确应指向 user 表里 role=teacher 的 id（王老师是 2）。</w:t>
+      </w:r>
+    </w:p>
+    <w:p>
+      <w:r>
+        <w:rPr>
+          <w:rFonts w:ascii="Microsoft YaHei" w:hAnsi="Microsoft YaHei" w:eastAsia="Microsoft YaHei"/>
+          <w:b w:val="0"/>
+          <w:sz w:val="22"/>
+        </w:rPr>
+        <w:t>今天学到 / 今天想明白</w:t>
+      </w:r>
+    </w:p>
+    <w:p>
+      <w:r>
+        <w:rPr>
+          <w:rFonts w:ascii="Microsoft YaHei" w:hAnsi="Microsoft YaHei" w:eastAsia="Microsoft YaHei"/>
+          <w:b w:val="0"/>
+          <w:sz w:val="22"/>
+        </w:rPr>
+        <w:t>想明白：--reload 让改完代码自动重启，不用每次 Ctrl+C 再敲启动命令；生产环境不加 --reload。</w:t>
+      </w:r>
+    </w:p>
+    <w:p>
+      <w:r>
+        <w:rPr>
+          <w:rFonts w:ascii="Microsoft YaHei" w:hAnsi="Microsoft YaHei" w:eastAsia="Microsoft YaHei"/>
+          <w:b w:val="0"/>
+          <w:sz w:val="22"/>
+        </w:rPr>
+        <w:t>想明白：Workbench 窗口里的 SQL 是临时草稿，与项目 .sql 文件不会自动同步，要手动写回（已踩两次）。</w:t>
+      </w:r>
+    </w:p>
+    <w:p>
+      <w:r>
+        <w:rPr>
+          <w:rFonts w:ascii="Microsoft YaHei" w:hAnsi="Microsoft YaHei" w:eastAsia="Microsoft YaHei"/>
+          <w:b w:val="0"/>
+          <w:sz w:val="22"/>
+        </w:rPr>
+        <w:t>想明白：文件是源头、数据库是结果——想改测试数据就先改文件再重跑，避免两边不一致。</w:t>
+      </w:r>
+    </w:p>
+    <w:p>
+      <w:r>
+        <w:rPr>
+          <w:rFonts w:ascii="Microsoft YaHei" w:hAnsi="Microsoft YaHei" w:eastAsia="Microsoft YaHei"/>
+          <w:b w:val="0"/>
+          <w:sz w:val="22"/>
+        </w:rPr>
+        <w:t>想明白：truncate 会清空整表并重置自增 id，所以 seed 文件开头放 truncate 就能反复跑，插完 id 稳定为 1~5。</w:t>
+      </w:r>
+    </w:p>
+    <w:p>
+      <w:r>
+        <w:rPr>
+          <w:rFonts w:ascii="Microsoft YaHei" w:hAnsi="Microsoft YaHei" w:eastAsia="Microsoft YaHei"/>
+          <w:b w:val="0"/>
+          <w:sz w:val="22"/>
+        </w:rPr>
+        <w:t>仍待消化（下次抽问）：主键/外键与唯一索引的区别；JOIN 写法（仍未写过）；外键约束 foreign key 怎么加。</w:t>
+      </w:r>
+    </w:p>
+    <w:p>
+      <w:r>
+        <w:rPr>
+          <w:rFonts w:ascii="Microsoft YaHei" w:hAnsi="Microsoft YaHei" w:eastAsia="Microsoft YaHei"/>
+          <w:b w:val="0"/>
+          <w:sz w:val="22"/>
+        </w:rPr>
+        <w:t>进度变化</w:t>
+      </w:r>
+    </w:p>
+    <w:p>
+      <w:r>
+        <w:rPr>
+          <w:rFonts w:ascii="Microsoft YaHei" w:hAnsi="Microsoft YaHei" w:eastAsia="Microsoft YaHei"/>
+          <w:b w:val="0"/>
+          <w:sz w:val="22"/>
+        </w:rPr>
+        <w:t>T7 后端完成：GET /courses 已通，返回 {'msg':'ok','courses':[...]}，字段含 id/course_name/teacher_id/credit/capacity；键名由 course 改为 courses，SELECT 补上 teacher_id。</w:t>
+      </w:r>
+    </w:p>
+    <w:p>
+      <w:r>
+        <w:rPr>
+          <w:rFonts w:ascii="Microsoft YaHei" w:hAnsi="Microsoft YaHei" w:eastAsia="Microsoft YaHei"/>
+          <w:b w:val="0"/>
+          <w:sz w:val="22"/>
+        </w:rPr>
+        <w:t>新增 sql/seed.sql（含 truncate + 5 条课程最终值），已在 Workbench 跑通；数据库与文件已一致。</w:t>
+      </w:r>
+    </w:p>
+    <w:p>
+      <w:r>
+        <w:rPr>
+          <w:rFonts w:ascii="Microsoft YaHei" w:hAnsi="Microsoft YaHei" w:eastAsia="Microsoft YaHei"/>
+          <w:b w:val="0"/>
+          <w:sz w:val="22"/>
+        </w:rPr>
+        <w:t>代码改动：backend/main.py（/courses 两处修正）、新增 sql/seed.sql。</w:t>
+      </w:r>
+    </w:p>
+    <w:p>
+      <w:r>
+        <w:rPr>
+          <w:rFonts w:ascii="Microsoft YaHei" w:hAnsi="Microsoft YaHei" w:eastAsia="Microsoft YaHei"/>
+          <w:b w:val="0"/>
+          <w:sz w:val="22"/>
+        </w:rPr>
+        <w:t>T7 前端未开始。</w:t>
+      </w:r>
+    </w:p>
+    <w:p>
+      <w:r>
+        <w:rPr>
+          <w:rFonts w:ascii="Microsoft YaHei" w:hAnsi="Microsoft YaHei" w:eastAsia="Microsoft YaHei"/>
+          <w:b w:val="0"/>
+          <w:sz w:val="22"/>
+        </w:rPr>
+        <w:t>下次从哪接着（精确起点）</w:t>
+      </w:r>
+    </w:p>
+    <w:p>
+      <w:r>
+        <w:rPr>
+          <w:rFonts w:ascii="Microsoft YaHei" w:hAnsi="Microsoft YaHei" w:eastAsia="Microsoft YaHei"/>
+          <w:b w:val="0"/>
+          <w:sz w:val="22"/>
+        </w:rPr>
+        <w:t>先起环境：Wamp 的 MariaDB 绿灯；cd /d I:\EE （2）\backend → python -m uvicorn main:app --reload --port 8080。</w:t>
+      </w:r>
+    </w:p>
+    <w:p>
+      <w:r>
+        <w:rPr>
+          <w:rFonts w:ascii="Microsoft YaHei" w:hAnsi="Microsoft YaHei" w:eastAsia="Microsoft YaHei"/>
+          <w:b w:val="0"/>
+          <w:sz w:val="22"/>
+        </w:rPr>
+        <w:t>前端第 1 小步：写 v-for 那三行（&lt;tr v-for=c in courses :key=c.id&gt;&lt;td&gt;{{c.course_name}}&lt;/td&gt;&lt;/tr&gt;）。</w:t>
+      </w:r>
+    </w:p>
+    <w:p>
+      <w:r>
+        <w:rPr>
+          <w:rFonts w:ascii="Microsoft YaHei" w:hAnsi="Microsoft YaHei" w:eastAsia="Microsoft YaHei"/>
+          <w:b w:val="0"/>
+          <w:sz w:val="22"/>
+        </w:rPr>
+        <w:t>然后：新建 api/course.js（getCourses 调 /courses）、views/Courses.vue（onMounted 里加载、表格渲染）、router 加 /courses 路由。</w:t>
+      </w:r>
+    </w:p>
+    <w:p>
+      <w:r>
+        <w:rPr>
+          <w:rFonts w:ascii="Microsoft YaHei" w:hAnsi="Microsoft YaHei" w:eastAsia="Microsoft YaHei"/>
+          <w:b w:val="0"/>
+          <w:sz w:val="22"/>
+        </w:rPr>
+        <w:t>口令：v-for 三行 → course.js → Courses.vue → 路由 → 浏览器 /courses 看列表</w:t>
+      </w:r>
+    </w:p>
+    <w:p>
+      <w:r>
+        <w:rPr>
+          <w:rFonts w:ascii="Microsoft YaHei" w:hAnsi="Microsoft YaHei" w:eastAsia="Microsoft YaHei"/>
+          <w:b w:val="0"/>
+          <w:sz w:val="22"/>
+        </w:rPr>
+        <w:t>----------------------------------------------------------------</w:t>
+      </w:r>
+    </w:p>
+    <w:p>
+      <w:r>
+        <w:rPr>
+          <w:rFonts w:ascii="Microsoft YaHei" w:hAnsi="Microsoft YaHei" w:eastAsia="Microsoft YaHei"/>
+          <w:b w:val="0"/>
+          <w:sz w:val="22"/>
+        </w:rPr>
+        <w:t>最后更新：2026-09-23，T7 后端收工（/courses 通）+ seed.sql 规范化；前端未开始。</w:t>
       </w:r>
     </w:p>
     <w:p>

</xml_diff>

<commit_message>
feat(T8): 选课关系表 student_course 建成
- sql/init.sql：追加 student_course 建表（id 主键 + student_id + course_id + 组合唯一约束）
- sql/seed.sql：追加选课测试数据，已验证幂等（跑两遍结果一致）
- docs：日记续写 2026-09-25（多对多、组合唯一、集合类比、主键 vs 唯一约束）
  手册/进度同步 T8 状态与数据表说明；开始页补 router-link 入口
</commit_message>
<xml_diff>
--- a/docs/学习总结完整版.docx
+++ b/docs/学习总结完整版.docx
@@ -1360,6 +1360,16 @@
           <w:b w:val="0"/>
           <w:sz w:val="22"/>
         </w:rPr>
+        <w:t>数据表：user（人）/ course（课）/ student_course（选课关系，多对多中间表，组合唯一约束）——2026-09-25 更新</w:t>
+      </w:r>
+    </w:p>
+    <w:p>
+      <w:r>
+        <w:rPr>
+          <w:rFonts w:ascii="Microsoft YaHei" w:hAnsi="Microsoft YaHei" w:eastAsia="Microsoft YaHei"/>
+          <w:b w:val="0"/>
+          <w:sz w:val="22"/>
+        </w:rPr>
         <w:t>要点：查库用 %s 参数化；CORS 允许 http://localhost:5173；后端端口约定 8080（Apache 在 8030）。</w:t>
       </w:r>
     </w:p>
@@ -1440,7 +1450,7 @@
           <w:b w:val="0"/>
           <w:sz w:val="22"/>
         </w:rPr>
-        <w:t>课程列表 / 选课（原 T7/T8）← T7 已完成（9/24）。下一步：T8 选课（多对多，建选课关系表 student_id + course_id）；前置可先补 JOIN 与 ref/.value 复习。</w:t>
+        <w:t>课程列表 / 选课（原 T7/T8）：T7 已完成（9/24）；T8 进行中（9/25），关系表已建，下一步 JOIN + 选课接口 + 页面。</w:t>
       </w:r>
     </w:p>
     <w:p>
@@ -1850,7 +1860,7 @@
           <w:b w:val="0"/>
           <w:sz w:val="22"/>
         </w:rPr>
-        <w:t>T8  |  选课  |  未做</w:t>
+        <w:t>T8  |  选课  |  进行中（9/25）：关系表 student_course 已建成（含组合唯一约束）+ 4 条测试数据；下一步学 JOIN 并做接口/页面</w:t>
       </w:r>
     </w:p>
     <w:p>
@@ -2510,7 +2520,7 @@
           <w:b w:val="0"/>
           <w:sz w:val="22"/>
         </w:rPr>
-        <w:t>课程列表（T7）← 已完成（2026-09-24）：数据库 + 后端接口 + 前端页面全通，浏览器可见 5 门课</w:t>
+        <w:t>课程列表（T7）已完成；选课（T8）进行中：关系表 student_course 已建（9/25），下一步 JOIN 与接口</w:t>
       </w:r>
     </w:p>
     <w:p>
@@ -3508,7 +3518,7 @@
           <w:b w:val="0"/>
           <w:sz w:val="22"/>
         </w:rPr>
-        <w:t>*最后更新：2026-09-24，T7 课程列表完成（前后端全通）。*</w:t>
+        <w:t>*最后更新：2026-09-25，T8 关系表建成，下一步学 JOIN。*</w:t>
       </w:r>
     </w:p>
     <w:p>
@@ -8320,7 +8330,267 @@
           <w:b w:val="0"/>
           <w:sz w:val="22"/>
         </w:rPr>
-        <w:t>至此 Q5 已通；待消化只剩主键/外键与唯一索引、JOIN、外键约束、CSS 布局。</w:t>
+        <w:t>————————————————</w:t>
+      </w:r>
+    </w:p>
+    <w:p>
+      <w:r>
+        <w:rPr>
+          <w:rFonts w:ascii="Microsoft YaHei" w:hAnsi="Microsoft YaHei" w:eastAsia="Microsoft YaHei"/>
+          <w:b w:val="0"/>
+          <w:sz w:val="22"/>
+        </w:rPr>
+        <w:t>续写：2026-09-25（T8 第 1 步 · 多对多关系表建成）</w:t>
+      </w:r>
+    </w:p>
+    <w:p>
+      <w:r>
+        <w:rPr>
+          <w:rFonts w:ascii="Microsoft YaHei" w:hAnsi="Microsoft YaHei" w:eastAsia="Microsoft YaHei"/>
+          <w:b w:val="0"/>
+          <w:sz w:val="22"/>
+        </w:rPr>
+        <w:t>今天做了什么</w:t>
+      </w:r>
+    </w:p>
+    <w:p>
+      <w:r>
+        <w:rPr>
+          <w:rFonts w:ascii="Microsoft YaHei" w:hAnsi="Microsoft YaHei" w:eastAsia="Microsoft YaHei"/>
+          <w:b w:val="0"/>
+          <w:sz w:val="22"/>
+        </w:rPr>
+        <w:t>热身两题：Q1 为什么 .value（const 锁盒子不锁内容 + ref 是盒子）——答对；Q2 模板里为什么不写 .value（Vue 自动解包）——复述基本立住。</w:t>
+      </w:r>
+    </w:p>
+    <w:p>
+      <w:r>
+        <w:rPr>
+          <w:rFonts w:ascii="Microsoft YaHei" w:hAnsi="Microsoft YaHei" w:eastAsia="Microsoft YaHei"/>
+          <w:b w:val="0"/>
+          <w:sz w:val="22"/>
+        </w:rPr>
+        <w:t>小尾巴收掉：Home.vue 加 &lt;router-link to=/courses&gt;查看课程&lt;/router-link&gt;，从首页可点进课程列表。</w:t>
+      </w:r>
+    </w:p>
+    <w:p>
+      <w:r>
+        <w:rPr>
+          <w:rFonts w:ascii="Microsoft YaHei" w:hAnsi="Microsoft YaHei" w:eastAsia="Microsoft YaHei"/>
+          <w:b w:val="0"/>
+          <w:sz w:val="22"/>
+        </w:rPr>
+        <w:t>T8 第 1 步：设计并建成多对多的中间表 student_course。表名在 student_course / enrollment / course_selection 之间选，最终定 student_course（一眼看懂 + 不与库名撞车）。</w:t>
+      </w:r>
+    </w:p>
+    <w:p>
+      <w:r>
+        <w:rPr>
+          <w:rFonts w:ascii="Microsoft YaHei" w:hAnsi="Microsoft YaHei" w:eastAsia="Microsoft YaHei"/>
+          <w:b w:val="0"/>
+          <w:sz w:val="22"/>
+        </w:rPr>
+        <w:t>建表 SQL 自己写，踩了三处：漏两个逗号、student_id 拼成 studeny_id、结尾少分号；另加了 unique key 组合唯一约束。</w:t>
+      </w:r>
+    </w:p>
+    <w:p>
+      <w:r>
+        <w:rPr>
+          <w:rFonts w:ascii="Microsoft YaHei" w:hAnsi="Microsoft YaHei" w:eastAsia="Microsoft YaHei"/>
+          <w:b w:val="0"/>
+          <w:sz w:val="22"/>
+        </w:rPr>
+        <w:t>首次建表没生效（数据库里没有该表）——又一次「SQL 写对了 ≠ 执行了」，在 Workbench 补跑后成功。</w:t>
+      </w:r>
+    </w:p>
+    <w:p>
+      <w:r>
+        <w:rPr>
+          <w:rFonts w:ascii="Microsoft YaHei" w:hAnsi="Microsoft YaHei" w:eastAsia="Microsoft YaHei"/>
+          <w:b w:val="0"/>
+          <w:sz w:val="22"/>
+        </w:rPr>
+        <w:t>插入 4 条测试数据成功；再故意插 (1,1) 触发 Error 1062 Duplicate entry '1-1' for key 'uk_student_course'，验证唯一约束确实在拦。</w:t>
+      </w:r>
+    </w:p>
+    <w:p>
+      <w:r>
+        <w:rPr>
+          <w:rFonts w:ascii="Microsoft YaHei" w:hAnsi="Microsoft YaHei" w:eastAsia="Microsoft YaHei"/>
+          <w:b w:val="0"/>
+          <w:sz w:val="22"/>
+        </w:rPr>
+        <w:t>把建表写回 sql/init.sql、把选课测试数据写回 sql/seed.sql；并跑脚本验证 seed.sql 幂等（连跑两遍都是 course 5 行、student_course 4 行）。</w:t>
+      </w:r>
+    </w:p>
+    <w:p>
+      <w:r>
+        <w:rPr>
+          <w:rFonts w:ascii="Microsoft YaHei" w:hAnsi="Microsoft YaHei" w:eastAsia="Microsoft YaHei"/>
+          <w:b w:val="0"/>
+          <w:sz w:val="22"/>
+        </w:rPr>
+        <w:t>今天想明白 / 仍易混</w:t>
+      </w:r>
+    </w:p>
+    <w:p>
+      <w:r>
+        <w:rPr>
+          <w:rFonts w:ascii="Microsoft YaHei" w:hAnsi="Microsoft YaHei" w:eastAsia="Microsoft YaHei"/>
+          <w:b w:val="0"/>
+          <w:sz w:val="22"/>
+        </w:rPr>
+        <w:t>想明白：unique key (a, b) 约束的是「组合」而不是各自单独——student_id 可以重复（一个学生选多门）、course_id 可以重复（一门课多人选），但同一个组合只能出现一次。</w:t>
+      </w:r>
+    </w:p>
+    <w:p>
+      <w:r>
+        <w:rPr>
+          <w:rFonts w:ascii="Microsoft YaHei" w:hAnsi="Microsoft YaHei" w:eastAsia="Microsoft YaHei"/>
+          <w:b w:val="0"/>
+          <w:sz w:val="22"/>
+        </w:rPr>
+        <w:t>想明白：这个约束等价于数学里的「有序对集合」——元素不能重复，且顺序有含义（(1,2) 是学生1选课程2，(2,1) 是学生2选课程1，两回事）。</w:t>
+      </w:r>
+    </w:p>
+    <w:p>
+      <w:r>
+        <w:rPr>
+          <w:rFonts w:ascii="Microsoft YaHei" w:hAnsi="Microsoft YaHei" w:eastAsia="Microsoft YaHei"/>
+          <w:b w:val="0"/>
+          <w:sz w:val="22"/>
+        </w:rPr>
+        <w:t>想明白：主键 vs 唯一约束——一张表只能一个主键、主键不能为 NULL、主键是「这一行的身份证」；唯一约束可以多个、可为 NULL、只管某个组合不重复。为什么不用联合主键：(student_id, course_id) 做联合主键技术上可以，但就没有单一 id 可用，前端退课按 id 操作更方便。</w:t>
+      </w:r>
+    </w:p>
+    <w:p>
+      <w:r>
+        <w:rPr>
+          <w:rFonts w:ascii="Microsoft YaHei" w:hAnsi="Microsoft YaHei" w:eastAsia="Microsoft YaHei"/>
+          <w:b w:val="0"/>
+          <w:sz w:val="22"/>
+        </w:rPr>
+        <w:t>想明白：该由数据库管的规矩别只靠代码——唯一约束是最后一道防线，别人绕过代码直接操作数据库也拦得住。</w:t>
+      </w:r>
+    </w:p>
+    <w:p>
+      <w:r>
+        <w:rPr>
+          <w:rFonts w:ascii="Microsoft YaHei" w:hAnsi="Microsoft YaHei" w:eastAsia="Microsoft YaHei"/>
+          <w:b w:val="0"/>
+          <w:sz w:val="22"/>
+        </w:rPr>
+        <w:t>仍待消化（下次抽问）：JOIN 写法（仍未写过，下一步就要用）；外键约束 foreign key 怎么加（目前两表之间没有约束）；索引；CSS 布局。</w:t>
+      </w:r>
+    </w:p>
+    <w:p>
+      <w:r>
+        <w:rPr>
+          <w:rFonts w:ascii="Microsoft YaHei" w:hAnsi="Microsoft YaHei" w:eastAsia="Microsoft YaHei"/>
+          <w:b w:val="0"/>
+          <w:sz w:val="22"/>
+        </w:rPr>
+        <w:t>进度变化</w:t>
+      </w:r>
+    </w:p>
+    <w:p>
+      <w:r>
+        <w:rPr>
+          <w:rFonts w:ascii="Microsoft YaHei" w:hAnsi="Microsoft YaHei" w:eastAsia="Microsoft YaHei"/>
+          <w:b w:val="0"/>
+          <w:sz w:val="22"/>
+        </w:rPr>
+        <w:t>T8 第 1 步完成：student_course 关系表建成（id 主键 + student_id + course_id + 组合唯一约束），4 条测试数据入库。</w:t>
+      </w:r>
+    </w:p>
+    <w:p>
+      <w:r>
+        <w:rPr>
+          <w:rFonts w:ascii="Microsoft YaHei" w:hAnsi="Microsoft YaHei" w:eastAsia="Microsoft YaHei"/>
+          <w:b w:val="0"/>
+          <w:sz w:val="22"/>
+        </w:rPr>
+        <w:t>sql/init.sql 追加 student_course 建表；sql/seed.sql 追加选课测试数据并验证幂等。</w:t>
+      </w:r>
+    </w:p>
+    <w:p>
+      <w:r>
+        <w:rPr>
+          <w:rFonts w:ascii="Microsoft YaHei" w:hAnsi="Microsoft YaHei" w:eastAsia="Microsoft YaHei"/>
+          <w:b w:val="0"/>
+          <w:sz w:val="22"/>
+        </w:rPr>
+        <w:t>T8 剩余：后端选课接口（选课/退课/我的课程）、前端选课页面。</w:t>
+      </w:r>
+    </w:p>
+    <w:p>
+      <w:r>
+        <w:rPr>
+          <w:rFonts w:ascii="Microsoft YaHei" w:hAnsi="Microsoft YaHei" w:eastAsia="Microsoft YaHei"/>
+          <w:b w:val="0"/>
+          <w:sz w:val="22"/>
+        </w:rPr>
+        <w:t>下次从哪接着（精确起点）</w:t>
+      </w:r>
+    </w:p>
+    <w:p>
+      <w:r>
+        <w:rPr>
+          <w:rFonts w:ascii="Microsoft YaHei" w:hAnsi="Microsoft YaHei" w:eastAsia="Microsoft YaHei"/>
+          <w:b w:val="0"/>
+          <w:sz w:val="22"/>
+        </w:rPr>
+        <w:t>下一步有新知识点：要显示「课程名 + 选课人数」或「我选了哪些课」，必须学 JOIN（连表查询）——建议单独一小课。</w:t>
+      </w:r>
+    </w:p>
+    <w:p>
+      <w:r>
+        <w:rPr>
+          <w:rFonts w:ascii="Microsoft YaHei" w:hAnsi="Microsoft YaHei" w:eastAsia="Microsoft YaHei"/>
+          <w:b w:val="0"/>
+          <w:sz w:val="22"/>
+        </w:rPr>
+        <w:t>顺序建议：先用 select 手写一条 JOIN 看结果 → 再写后端接口 → 最后前端页面。</w:t>
+      </w:r>
+    </w:p>
+    <w:p>
+      <w:r>
+        <w:rPr>
+          <w:rFonts w:ascii="Microsoft YaHei" w:hAnsi="Microsoft YaHei" w:eastAsia="Microsoft YaHei"/>
+          <w:b w:val="0"/>
+          <w:sz w:val="22"/>
+        </w:rPr>
+        <w:t>T8 设计待定：选课接口要不要 token（要，因为必须知道「你是谁」）；退课如何做（按 student_course.id 删除并用 where 限定本人）。</w:t>
+      </w:r>
+    </w:p>
+    <w:p>
+      <w:r>
+        <w:rPr>
+          <w:rFonts w:ascii="Microsoft YaHei" w:hAnsi="Microsoft YaHei" w:eastAsia="Microsoft YaHei"/>
+          <w:b w:val="0"/>
+          <w:sz w:val="22"/>
+        </w:rPr>
+        <w:t>口令：先手写 join 看结果 → 后端接口 → 前端页面</w:t>
+      </w:r>
+    </w:p>
+    <w:p>
+      <w:r>
+        <w:rPr>
+          <w:rFonts w:ascii="Microsoft YaHei" w:hAnsi="Microsoft YaHei" w:eastAsia="Microsoft YaHei"/>
+          <w:b w:val="0"/>
+          <w:sz w:val="22"/>
+        </w:rPr>
+        <w:t>----------------------------------------------------------------</w:t>
+      </w:r>
+    </w:p>
+    <w:p>
+      <w:r>
+        <w:rPr>
+          <w:rFonts w:ascii="Microsoft YaHei" w:hAnsi="Microsoft YaHei" w:eastAsia="Microsoft YaHei"/>
+          <w:b w:val="0"/>
+          <w:sz w:val="22"/>
+        </w:rPr>
+        <w:t>最后更新：2026-09-25，T8 关系表建成（含组合唯一约束），下一步学 JOIN。</w:t>
       </w:r>
     </w:p>
     <w:p>

</xml_diff>